<commit_message>
Updated slides and script based off group feedback
</commit_message>
<xml_diff>
--- a/project_documents/Presentation 1 Script.docx
+++ b/project_documents/Presentation 1 Script.docx
@@ -105,7 +105,7 @@
           <w:noProof/>
           <w:kern w:val="0"/>
         </w:rPr>
-        <w:pict w14:anchorId="19EBE668">
+        <w:pict w14:anchorId="5A035926">
           <v:rect id="_x0000_i1031" alt="" style="width:468pt;height:.05pt;mso-width-percent:0;mso-height-percent:0;mso-width-percent:0;mso-height-percent:0" o:hralign="center" o:hrstd="t" o:hr="t" fillcolor="#a0a0a0" stroked="f"/>
         </w:pict>
       </w:r>
@@ -223,7 +223,7 @@
           <w:noProof/>
           <w:kern w:val="0"/>
         </w:rPr>
-        <w:pict w14:anchorId="7CE223D8">
+        <w:pict w14:anchorId="036F9BEC">
           <v:rect id="_x0000_i1030" alt="" style="width:468pt;height:.05pt;mso-width-percent:0;mso-height-percent:0;mso-width-percent:0;mso-height-percent:0" o:hralign="center" o:hrstd="t" o:hr="t" fillcolor="#a0a0a0" stroked="f"/>
         </w:pict>
       </w:r>
@@ -330,7 +330,7 @@
           <w:noProof/>
           <w:kern w:val="0"/>
         </w:rPr>
-        <w:pict w14:anchorId="041C20CA">
+        <w:pict w14:anchorId="5E43E7DC">
           <v:rect id="_x0000_i1029" alt="" style="width:468pt;height:.05pt;mso-width-percent:0;mso-height-percent:0;mso-width-percent:0;mso-height-percent:0" o:hralign="center" o:hrstd="t" o:hr="t" fillcolor="#a0a0a0" stroked="f"/>
         </w:pict>
       </w:r>
@@ -404,6 +404,22 @@
         </w:rPr>
         <w:t>The second deliverable is a comparative sentiment analysis designed to identify and quantify sentiment trends across products, brands, and categories.</w:t>
       </w:r>
+      <w:r>
+        <w:rPr>
+          <w:rFonts w:ascii="Times New Roman" w:eastAsia="Times New Roman" w:hAnsi="Times New Roman" w:cs="Times New Roman"/>
+          <w:kern w:val="0"/>
+          <w14:ligatures w14:val="none"/>
+        </w:rPr>
+        <w:t xml:space="preserve"> </w:t>
+      </w:r>
+      <w:r>
+        <w:rPr>
+          <w:rFonts w:ascii="Times New Roman" w:eastAsia="Times New Roman" w:hAnsi="Times New Roman" w:cs="Times New Roman"/>
+          <w:kern w:val="0"/>
+          <w14:ligatures w14:val="none"/>
+        </w:rPr>
+        <w:t>I also plan to explore whether sentiment can be evaluated at the product-feature level, such as performance, durability, and value, rather than relying solely on an overall sentiment score.</w:t>
+      </w:r>
     </w:p>
     <w:p>
       <w:pPr>
@@ -422,6 +438,14 @@
         </w:rPr>
         <w:t>The third deliverable is an evaluation of multiple sentiment analysis approaches to determine which methods perform most effectively within this domain.</w:t>
       </w:r>
+      <w:r>
+        <w:rPr>
+          <w:rFonts w:ascii="Times New Roman" w:eastAsia="Times New Roman" w:hAnsi="Times New Roman" w:cs="Times New Roman"/>
+          <w:kern w:val="0"/>
+          <w14:ligatures w14:val="none"/>
+        </w:rPr>
+        <w:t xml:space="preserve"> </w:t>
+      </w:r>
     </w:p>
     <w:p>
       <w:pPr>
@@ -474,7 +498,7 @@
           <w:noProof/>
           <w:kern w:val="0"/>
         </w:rPr>
-        <w:pict w14:anchorId="59EF3C63">
+        <w:pict w14:anchorId="67183BD3">
           <v:rect id="_x0000_i1028" alt="" style="width:468pt;height:.05pt;mso-width-percent:0;mso-height-percent:0;mso-width-percent:0;mso-height-percent:0" o:hralign="center" o:hrstd="t" o:hr="t" fillcolor="#a0a0a0" stroked="f"/>
         </w:pict>
       </w:r>
@@ -527,6 +551,7 @@
           <w:kern w:val="0"/>
           <w14:ligatures w14:val="none"/>
         </w:rPr>
+        <w:lastRenderedPageBreak/>
         <w:t>The project will be developed using Python and supporting libraries including Playwright for web scraping, Pandas for data processing, and several NLP libraries such as Transformers, NLTK, and spaCy.</w:t>
       </w:r>
     </w:p>
@@ -545,7 +570,6 @@
           <w:kern w:val="0"/>
           <w14:ligatures w14:val="none"/>
         </w:rPr>
-        <w:lastRenderedPageBreak/>
         <w:t>Several project resources are already in place. A prototype scraper has been successfully developed, approximately 300 review articles have already been identified, and a project timeline has been established. In addition, my familiarity with mountain bike products and categories will help support data validation and interpretation of findings.</w:t>
       </w:r>
     </w:p>
@@ -564,7 +588,7 @@
           <w:noProof/>
           <w:kern w:val="0"/>
         </w:rPr>
-        <w:pict w14:anchorId="6F62709F">
+        <w:pict w14:anchorId="4ACDE8BE">
           <v:rect id="_x0000_i1027" alt="" style="width:468pt;height:.05pt;mso-width-percent:0;mso-height-percent:0;mso-width-percent:0;mso-height-percent:0" o:hralign="center" o:hrstd="t" o:hr="t" fillcolor="#a0a0a0" stroked="f"/>
         </w:pict>
       </w:r>
@@ -617,7 +641,15 @@
           <w:kern w:val="0"/>
           <w14:ligatures w14:val="none"/>
         </w:rPr>
-        <w:t>The project is limited to publicly available review content, and review volume is dependent on the availability of published articles. Additionally, professional reviews may not fully reflect consumer sentiment, which should be considered when interpreting results.</w:t>
+        <w:t xml:space="preserve">The project is limited to publicly available review content, and review volume is dependent on the availability of published articles. </w:t>
+      </w:r>
+      <w:r>
+        <w:rPr>
+          <w:rFonts w:ascii="Times New Roman" w:eastAsia="Times New Roman" w:hAnsi="Times New Roman" w:cs="Times New Roman"/>
+          <w:kern w:val="0"/>
+          <w14:ligatures w14:val="none"/>
+        </w:rPr>
+        <w:t>Additionally, professional reviews may not fully reflect consumer sentiment, which should be considered when interpreting results. The findings from this project should therefore be interpreted as insights derived from professional reviewers rather than a direct representation of all mountain bike consumers.</w:t>
       </w:r>
     </w:p>
     <w:p>
@@ -653,6 +685,7 @@
           <w:kern w:val="0"/>
           <w14:ligatures w14:val="none"/>
         </w:rPr>
+        <w:lastRenderedPageBreak/>
         <w:t>The project also assumes that product classifications and extracted entities can be identified with reasonable accuracy.</w:t>
       </w:r>
     </w:p>
@@ -671,7 +704,7 @@
           <w:noProof/>
           <w:kern w:val="0"/>
         </w:rPr>
-        <w:pict w14:anchorId="244A42D9">
+        <w:pict w14:anchorId="7A07295E">
           <v:rect id="_x0000_i1026" alt="" style="width:468pt;height:.05pt;mso-width-percent:0;mso-height-percent:0;mso-width-percent:0;mso-height-percent:0" o:hralign="center" o:hrstd="t" o:hr="t" fillcolor="#a0a0a0" stroked="f"/>
         </w:pict>
       </w:r>
@@ -724,7 +757,6 @@
           <w:kern w:val="0"/>
           <w14:ligatures w14:val="none"/>
         </w:rPr>
-        <w:lastRenderedPageBreak/>
         <w:t>One risk is that website structure changes could disrupt data collection. To address this, a backup data source has been identified and the scraper can be updated if necessary.</w:t>
       </w:r>
     </w:p>
@@ -815,7 +847,7 @@
           <w:noProof/>
           <w:kern w:val="0"/>
         </w:rPr>
-        <w:pict w14:anchorId="40B6CE70">
+        <w:pict w14:anchorId="19007A59">
           <v:rect id="_x0000_i1025" alt="" style="width:468pt;height:.05pt;mso-width-percent:0;mso-height-percent:0;mso-width-percent:0;mso-height-percent:0" o:hralign="center" o:hrstd="t" o:hr="t" fillcolor="#a0a0a0" stroked="f"/>
         </w:pict>
       </w:r>
@@ -832,6 +864,7 @@
         <w:rPr>
           <w:rFonts w:eastAsia="Times New Roman"/>
         </w:rPr>
+        <w:lastRenderedPageBreak/>
         <w:t>Slide 8 – Project Plan &amp; Timeline</w:t>
       </w:r>
     </w:p>
@@ -904,7 +937,6 @@
           <w:kern w:val="0"/>
           <w14:ligatures w14:val="none"/>
         </w:rPr>
-        <w:lastRenderedPageBreak/>
         <w:t>The primary analysis phase, including sentiment analysis and model evaluation, will take place throughout July. Business findings and recommendations will be developed during the latter part of the month.</w:t>
       </w:r>
     </w:p>

</xml_diff>

<commit_message>
Updated slides and script based off group feedback (#8)
</commit_message>
<xml_diff>
--- a/project_documents/Presentation 1 Script.docx
+++ b/project_documents/Presentation 1 Script.docx
@@ -105,7 +105,7 @@
           <w:noProof/>
           <w:kern w:val="0"/>
         </w:rPr>
-        <w:pict w14:anchorId="19EBE668">
+        <w:pict w14:anchorId="5A035926">
           <v:rect id="_x0000_i1031" alt="" style="width:468pt;height:.05pt;mso-width-percent:0;mso-height-percent:0;mso-width-percent:0;mso-height-percent:0" o:hralign="center" o:hrstd="t" o:hr="t" fillcolor="#a0a0a0" stroked="f"/>
         </w:pict>
       </w:r>
@@ -223,7 +223,7 @@
           <w:noProof/>
           <w:kern w:val="0"/>
         </w:rPr>
-        <w:pict w14:anchorId="7CE223D8">
+        <w:pict w14:anchorId="036F9BEC">
           <v:rect id="_x0000_i1030" alt="" style="width:468pt;height:.05pt;mso-width-percent:0;mso-height-percent:0;mso-width-percent:0;mso-height-percent:0" o:hralign="center" o:hrstd="t" o:hr="t" fillcolor="#a0a0a0" stroked="f"/>
         </w:pict>
       </w:r>
@@ -330,7 +330,7 @@
           <w:noProof/>
           <w:kern w:val="0"/>
         </w:rPr>
-        <w:pict w14:anchorId="041C20CA">
+        <w:pict w14:anchorId="5E43E7DC">
           <v:rect id="_x0000_i1029" alt="" style="width:468pt;height:.05pt;mso-width-percent:0;mso-height-percent:0;mso-width-percent:0;mso-height-percent:0" o:hralign="center" o:hrstd="t" o:hr="t" fillcolor="#a0a0a0" stroked="f"/>
         </w:pict>
       </w:r>
@@ -404,6 +404,22 @@
         </w:rPr>
         <w:t>The second deliverable is a comparative sentiment analysis designed to identify and quantify sentiment trends across products, brands, and categories.</w:t>
       </w:r>
+      <w:r>
+        <w:rPr>
+          <w:rFonts w:ascii="Times New Roman" w:eastAsia="Times New Roman" w:hAnsi="Times New Roman" w:cs="Times New Roman"/>
+          <w:kern w:val="0"/>
+          <w14:ligatures w14:val="none"/>
+        </w:rPr>
+        <w:t xml:space="preserve"> </w:t>
+      </w:r>
+      <w:r>
+        <w:rPr>
+          <w:rFonts w:ascii="Times New Roman" w:eastAsia="Times New Roman" w:hAnsi="Times New Roman" w:cs="Times New Roman"/>
+          <w:kern w:val="0"/>
+          <w14:ligatures w14:val="none"/>
+        </w:rPr>
+        <w:t>I also plan to explore whether sentiment can be evaluated at the product-feature level, such as performance, durability, and value, rather than relying solely on an overall sentiment score.</w:t>
+      </w:r>
     </w:p>
     <w:p>
       <w:pPr>
@@ -422,6 +438,14 @@
         </w:rPr>
         <w:t>The third deliverable is an evaluation of multiple sentiment analysis approaches to determine which methods perform most effectively within this domain.</w:t>
       </w:r>
+      <w:r>
+        <w:rPr>
+          <w:rFonts w:ascii="Times New Roman" w:eastAsia="Times New Roman" w:hAnsi="Times New Roman" w:cs="Times New Roman"/>
+          <w:kern w:val="0"/>
+          <w14:ligatures w14:val="none"/>
+        </w:rPr>
+        <w:t xml:space="preserve"> </w:t>
+      </w:r>
     </w:p>
     <w:p>
       <w:pPr>
@@ -474,7 +498,7 @@
           <w:noProof/>
           <w:kern w:val="0"/>
         </w:rPr>
-        <w:pict w14:anchorId="59EF3C63">
+        <w:pict w14:anchorId="67183BD3">
           <v:rect id="_x0000_i1028" alt="" style="width:468pt;height:.05pt;mso-width-percent:0;mso-height-percent:0;mso-width-percent:0;mso-height-percent:0" o:hralign="center" o:hrstd="t" o:hr="t" fillcolor="#a0a0a0" stroked="f"/>
         </w:pict>
       </w:r>
@@ -527,6 +551,7 @@
           <w:kern w:val="0"/>
           <w14:ligatures w14:val="none"/>
         </w:rPr>
+        <w:lastRenderedPageBreak/>
         <w:t>The project will be developed using Python and supporting libraries including Playwright for web scraping, Pandas for data processing, and several NLP libraries such as Transformers, NLTK, and spaCy.</w:t>
       </w:r>
     </w:p>
@@ -545,7 +570,6 @@
           <w:kern w:val="0"/>
           <w14:ligatures w14:val="none"/>
         </w:rPr>
-        <w:lastRenderedPageBreak/>
         <w:t>Several project resources are already in place. A prototype scraper has been successfully developed, approximately 300 review articles have already been identified, and a project timeline has been established. In addition, my familiarity with mountain bike products and categories will help support data validation and interpretation of findings.</w:t>
       </w:r>
     </w:p>
@@ -564,7 +588,7 @@
           <w:noProof/>
           <w:kern w:val="0"/>
         </w:rPr>
-        <w:pict w14:anchorId="6F62709F">
+        <w:pict w14:anchorId="4ACDE8BE">
           <v:rect id="_x0000_i1027" alt="" style="width:468pt;height:.05pt;mso-width-percent:0;mso-height-percent:0;mso-width-percent:0;mso-height-percent:0" o:hralign="center" o:hrstd="t" o:hr="t" fillcolor="#a0a0a0" stroked="f"/>
         </w:pict>
       </w:r>
@@ -617,7 +641,15 @@
           <w:kern w:val="0"/>
           <w14:ligatures w14:val="none"/>
         </w:rPr>
-        <w:t>The project is limited to publicly available review content, and review volume is dependent on the availability of published articles. Additionally, professional reviews may not fully reflect consumer sentiment, which should be considered when interpreting results.</w:t>
+        <w:t xml:space="preserve">The project is limited to publicly available review content, and review volume is dependent on the availability of published articles. </w:t>
+      </w:r>
+      <w:r>
+        <w:rPr>
+          <w:rFonts w:ascii="Times New Roman" w:eastAsia="Times New Roman" w:hAnsi="Times New Roman" w:cs="Times New Roman"/>
+          <w:kern w:val="0"/>
+          <w14:ligatures w14:val="none"/>
+        </w:rPr>
+        <w:t>Additionally, professional reviews may not fully reflect consumer sentiment, which should be considered when interpreting results. The findings from this project should therefore be interpreted as insights derived from professional reviewers rather than a direct representation of all mountain bike consumers.</w:t>
       </w:r>
     </w:p>
     <w:p>
@@ -653,6 +685,7 @@
           <w:kern w:val="0"/>
           <w14:ligatures w14:val="none"/>
         </w:rPr>
+        <w:lastRenderedPageBreak/>
         <w:t>The project also assumes that product classifications and extracted entities can be identified with reasonable accuracy.</w:t>
       </w:r>
     </w:p>
@@ -671,7 +704,7 @@
           <w:noProof/>
           <w:kern w:val="0"/>
         </w:rPr>
-        <w:pict w14:anchorId="244A42D9">
+        <w:pict w14:anchorId="7A07295E">
           <v:rect id="_x0000_i1026" alt="" style="width:468pt;height:.05pt;mso-width-percent:0;mso-height-percent:0;mso-width-percent:0;mso-height-percent:0" o:hralign="center" o:hrstd="t" o:hr="t" fillcolor="#a0a0a0" stroked="f"/>
         </w:pict>
       </w:r>
@@ -724,7 +757,6 @@
           <w:kern w:val="0"/>
           <w14:ligatures w14:val="none"/>
         </w:rPr>
-        <w:lastRenderedPageBreak/>
         <w:t>One risk is that website structure changes could disrupt data collection. To address this, a backup data source has been identified and the scraper can be updated if necessary.</w:t>
       </w:r>
     </w:p>
@@ -815,7 +847,7 @@
           <w:noProof/>
           <w:kern w:val="0"/>
         </w:rPr>
-        <w:pict w14:anchorId="40B6CE70">
+        <w:pict w14:anchorId="19007A59">
           <v:rect id="_x0000_i1025" alt="" style="width:468pt;height:.05pt;mso-width-percent:0;mso-height-percent:0;mso-width-percent:0;mso-height-percent:0" o:hralign="center" o:hrstd="t" o:hr="t" fillcolor="#a0a0a0" stroked="f"/>
         </w:pict>
       </w:r>
@@ -832,6 +864,7 @@
         <w:rPr>
           <w:rFonts w:eastAsia="Times New Roman"/>
         </w:rPr>
+        <w:lastRenderedPageBreak/>
         <w:t>Slide 8 – Project Plan &amp; Timeline</w:t>
       </w:r>
     </w:p>
@@ -904,7 +937,6 @@
           <w:kern w:val="0"/>
           <w14:ligatures w14:val="none"/>
         </w:rPr>
-        <w:lastRenderedPageBreak/>
         <w:t>The primary analysis phase, including sentiment analysis and model evaluation, will take place throughout July. Business findings and recommendations will be developed during the latter part of the month.</w:t>
       </w:r>
     </w:p>

</xml_diff>